<commit_message>
Complete chapter 8 safety, empirical normalization and INT8 verification
</commit_message>
<xml_diff>
--- a/chapter8_latest/outputs/第八章实验报告.docx
+++ b/chapter8_latest/outputs/第八章实验报告.docx
@@ -40,13 +40,13 @@
         <w:tblLook w:firstColumn="1" w:firstRow="1" w:lastColumn="0" w:lastRow="0" w:noHBand="0" w:noVBand="1" w:val="04A0"/>
       </w:tblPr>
       <w:tblGrid>
-        <w:gridCol w:w="4802"/>
-        <w:gridCol w:w="4802"/>
+        <w:gridCol w:w="7265"/>
+        <w:gridCol w:w="7265"/>
       </w:tblGrid>
       <w:tr>
         <w:tc>
           <w:tcPr>
-            <w:tcW w:type="dxa" w:w="4802"/>
+            <w:tcW w:type="dxa" w:w="7265"/>
           </w:tcPr>
           <w:p>
             <w:r>
@@ -56,7 +56,7 @@
         </w:tc>
         <w:tc>
           <w:tcPr>
-            <w:tcW w:type="dxa" w:w="4802"/>
+            <w:tcW w:type="dxa" w:w="7265"/>
           </w:tcPr>
           <w:p>
             <w:r>
@@ -68,7 +68,7 @@
       <w:tr>
         <w:tc>
           <w:tcPr>
-            <w:tcW w:type="dxa" w:w="4802"/>
+            <w:tcW w:type="dxa" w:w="7265"/>
           </w:tcPr>
           <w:p>
             <w:r>
@@ -78,7 +78,7 @@
         </w:tc>
         <w:tc>
           <w:tcPr>
-            <w:tcW w:type="dxa" w:w="4802"/>
+            <w:tcW w:type="dxa" w:w="7265"/>
           </w:tcPr>
           <w:p>
             <w:r>
@@ -90,7 +90,7 @@
       <w:tr>
         <w:tc>
           <w:tcPr>
-            <w:tcW w:type="dxa" w:w="4802"/>
+            <w:tcW w:type="dxa" w:w="7265"/>
           </w:tcPr>
           <w:p>
             <w:r>
@@ -100,7 +100,7 @@
         </w:tc>
         <w:tc>
           <w:tcPr>
-            <w:tcW w:type="dxa" w:w="4802"/>
+            <w:tcW w:type="dxa" w:w="7265"/>
           </w:tcPr>
           <w:p>
             <w:r>
@@ -112,7 +112,7 @@
       <w:tr>
         <w:tc>
           <w:tcPr>
-            <w:tcW w:type="dxa" w:w="4802"/>
+            <w:tcW w:type="dxa" w:w="7265"/>
           </w:tcPr>
           <w:p>
             <w:r>
@@ -122,7 +122,7 @@
         </w:tc>
         <w:tc>
           <w:tcPr>
-            <w:tcW w:type="dxa" w:w="4802"/>
+            <w:tcW w:type="dxa" w:w="7265"/>
           </w:tcPr>
           <w:p>
             <w:r>
@@ -134,7 +134,7 @@
       <w:tr>
         <w:tc>
           <w:tcPr>
-            <w:tcW w:type="dxa" w:w="4802"/>
+            <w:tcW w:type="dxa" w:w="7265"/>
           </w:tcPr>
           <w:p>
             <w:r>
@@ -144,7 +144,7 @@
         </w:tc>
         <w:tc>
           <w:tcPr>
-            <w:tcW w:type="dxa" w:w="4802"/>
+            <w:tcW w:type="dxa" w:w="7265"/>
           </w:tcPr>
           <w:p>
             <w:r>
@@ -156,7 +156,7 @@
       <w:tr>
         <w:tc>
           <w:tcPr>
-            <w:tcW w:type="dxa" w:w="4802"/>
+            <w:tcW w:type="dxa" w:w="7265"/>
           </w:tcPr>
           <w:p>
             <w:r>
@@ -166,7 +166,7 @@
         </w:tc>
         <w:tc>
           <w:tcPr>
-            <w:tcW w:type="dxa" w:w="4802"/>
+            <w:tcW w:type="dxa" w:w="7265"/>
           </w:tcPr>
           <w:p>
             <w:r>
@@ -178,7 +178,7 @@
       <w:tr>
         <w:tc>
           <w:tcPr>
-            <w:tcW w:type="dxa" w:w="4802"/>
+            <w:tcW w:type="dxa" w:w="7265"/>
           </w:tcPr>
           <w:p>
             <w:r>
@@ -188,7 +188,7 @@
         </w:tc>
         <w:tc>
           <w:tcPr>
-            <w:tcW w:type="dxa" w:w="4802"/>
+            <w:tcW w:type="dxa" w:w="7265"/>
           </w:tcPr>
           <w:p>
             <w:r>
@@ -200,7 +200,7 @@
       <w:tr>
         <w:tc>
           <w:tcPr>
-            <w:tcW w:type="dxa" w:w="4802"/>
+            <w:tcW w:type="dxa" w:w="7265"/>
           </w:tcPr>
           <w:p>
             <w:r>
@@ -210,7 +210,7 @@
         </w:tc>
         <w:tc>
           <w:tcPr>
-            <w:tcW w:type="dxa" w:w="4802"/>
+            <w:tcW w:type="dxa" w:w="7265"/>
           </w:tcPr>
           <w:p>
             <w:r>
@@ -222,7 +222,7 @@
       <w:tr>
         <w:tc>
           <w:tcPr>
-            <w:tcW w:type="dxa" w:w="4802"/>
+            <w:tcW w:type="dxa" w:w="7265"/>
           </w:tcPr>
           <w:p>
             <w:r>
@@ -232,7 +232,7 @@
         </w:tc>
         <w:tc>
           <w:tcPr>
-            <w:tcW w:type="dxa" w:w="4802"/>
+            <w:tcW w:type="dxa" w:w="7265"/>
           </w:tcPr>
           <w:p>
             <w:r>
@@ -244,7 +244,7 @@
       <w:tr>
         <w:tc>
           <w:tcPr>
-            <w:tcW w:type="dxa" w:w="4802"/>
+            <w:tcW w:type="dxa" w:w="7265"/>
           </w:tcPr>
           <w:p>
             <w:r>
@@ -254,7 +254,7 @@
         </w:tc>
         <w:tc>
           <w:tcPr>
-            <w:tcW w:type="dxa" w:w="4802"/>
+            <w:tcW w:type="dxa" w:w="7265"/>
           </w:tcPr>
           <w:p>
             <w:r>
@@ -266,7 +266,7 @@
       <w:tr>
         <w:tc>
           <w:tcPr>
-            <w:tcW w:type="dxa" w:w="4802"/>
+            <w:tcW w:type="dxa" w:w="7265"/>
           </w:tcPr>
           <w:p>
             <w:r>
@@ -276,7 +276,7 @@
         </w:tc>
         <w:tc>
           <w:tcPr>
-            <w:tcW w:type="dxa" w:w="4802"/>
+            <w:tcW w:type="dxa" w:w="7265"/>
           </w:tcPr>
           <w:p>
             <w:r>
@@ -326,6 +326,11 @@
     </w:p>
     <w:p>
       <w:r>
+        <w:t>另外实现了数据拟合的经验 Z-score：用 12000 条校准记录拟合均值和标准差，常量通道使用尺度 1；通过首层权重/偏置的仿射折叠保持原策略函数。在 4000 条留出记录上，坐标变换前后最大归一化动作差为 1.47e-15。这是训练后的等价坐标变换，原百万步训练历史仍使用原工程尺度。统计量及等价 actor 单独保存，未直接更换输入尺度而破坏已学控制律。</w:t>
+      </w:r>
+    </w:p>
+    <w:p>
+      <w:r>
         <w:t>域随机化覆盖质量 ±20%、初始油液体积模量 600–1400 MPa、摩擦 ±30%；若训练同时随机化负载/刚度故障，评估条件属于训练包络覆盖下的仿真鲁棒性验证。没有真实试验台数据，本项目没有完成真机迁移或真机小样本微调。</w:t>
       </w:r>
     </w:p>
@@ -341,7 +346,7 @@
       <w:r>
         <w:drawing>
           <wp:inline xmlns:a="http://schemas.openxmlformats.org/drawingml/2006/main" xmlns:pic="http://schemas.openxmlformats.org/drawingml/2006/picture">
-            <wp:extent cx="6080760" cy="3508904"/>
+            <wp:extent cx="8961120" cy="5171017"/>
             <wp:docPr id="1" name="Picture 1"/>
             <wp:cNvGraphicFramePr>
               <a:graphicFrameLocks noChangeAspect="1"/>
@@ -362,7 +367,7 @@
                   <pic:spPr>
                     <a:xfrm>
                       <a:off x="0" y="0"/>
-                      <a:ext cx="6080760" cy="3508904"/>
+                      <a:ext cx="8961120" cy="5171017"/>
                     </a:xfrm>
                     <a:prstGeom prst="rect"/>
                   </pic:spPr>
@@ -388,17 +393,17 @@
         <w:tblLook w:firstColumn="1" w:firstRow="1" w:lastColumn="0" w:lastRow="0" w:noHBand="0" w:noVBand="1" w:val="04A0"/>
       </w:tblPr>
       <w:tblGrid>
-        <w:gridCol w:w="1601"/>
-        <w:gridCol w:w="1601"/>
-        <w:gridCol w:w="1601"/>
-        <w:gridCol w:w="1601"/>
-        <w:gridCol w:w="1601"/>
-        <w:gridCol w:w="1601"/>
+        <w:gridCol w:w="2422"/>
+        <w:gridCol w:w="2422"/>
+        <w:gridCol w:w="2422"/>
+        <w:gridCol w:w="2422"/>
+        <w:gridCol w:w="2422"/>
+        <w:gridCol w:w="2422"/>
       </w:tblGrid>
       <w:tr>
         <w:tc>
           <w:tcPr>
-            <w:tcW w:type="dxa" w:w="1601"/>
+            <w:tcW w:type="dxa" w:w="2422"/>
           </w:tcPr>
           <w:p>
             <w:r>
@@ -408,7 +413,7 @@
         </w:tc>
         <w:tc>
           <w:tcPr>
-            <w:tcW w:type="dxa" w:w="1601"/>
+            <w:tcW w:type="dxa" w:w="2422"/>
           </w:tcPr>
           <w:p>
             <w:r>
@@ -418,7 +423,7 @@
         </w:tc>
         <w:tc>
           <w:tcPr>
-            <w:tcW w:type="dxa" w:w="1601"/>
+            <w:tcW w:type="dxa" w:w="2422"/>
           </w:tcPr>
           <w:p>
             <w:r>
@@ -428,7 +433,7 @@
         </w:tc>
         <w:tc>
           <w:tcPr>
-            <w:tcW w:type="dxa" w:w="1601"/>
+            <w:tcW w:type="dxa" w:w="2422"/>
           </w:tcPr>
           <w:p>
             <w:r>
@@ -438,7 +443,7 @@
         </w:tc>
         <w:tc>
           <w:tcPr>
-            <w:tcW w:type="dxa" w:w="1601"/>
+            <w:tcW w:type="dxa" w:w="2422"/>
           </w:tcPr>
           <w:p>
             <w:r>
@@ -448,7 +453,7 @@
         </w:tc>
         <w:tc>
           <w:tcPr>
-            <w:tcW w:type="dxa" w:w="1601"/>
+            <w:tcW w:type="dxa" w:w="2422"/>
           </w:tcPr>
           <w:p>
             <w:r>
@@ -460,7 +465,7 @@
       <w:tr>
         <w:tc>
           <w:tcPr>
-            <w:tcW w:type="dxa" w:w="1601"/>
+            <w:tcW w:type="dxa" w:w="2422"/>
           </w:tcPr>
           <w:p>
             <w:r>
@@ -470,7 +475,7 @@
         </w:tc>
         <w:tc>
           <w:tcPr>
-            <w:tcW w:type="dxa" w:w="1601"/>
+            <w:tcW w:type="dxa" w:w="2422"/>
           </w:tcPr>
           <w:p>
             <w:r>
@@ -480,7 +485,7 @@
         </w:tc>
         <w:tc>
           <w:tcPr>
-            <w:tcW w:type="dxa" w:w="1601"/>
+            <w:tcW w:type="dxa" w:w="2422"/>
           </w:tcPr>
           <w:p>
             <w:r>
@@ -490,7 +495,7 @@
         </w:tc>
         <w:tc>
           <w:tcPr>
-            <w:tcW w:type="dxa" w:w="1601"/>
+            <w:tcW w:type="dxa" w:w="2422"/>
           </w:tcPr>
           <w:p>
             <w:r>
@@ -500,7 +505,7 @@
         </w:tc>
         <w:tc>
           <w:tcPr>
-            <w:tcW w:type="dxa" w:w="1601"/>
+            <w:tcW w:type="dxa" w:w="2422"/>
           </w:tcPr>
           <w:p>
             <w:r>
@@ -510,7 +515,7 @@
         </w:tc>
         <w:tc>
           <w:tcPr>
-            <w:tcW w:type="dxa" w:w="1601"/>
+            <w:tcW w:type="dxa" w:w="2422"/>
           </w:tcPr>
           <w:p>
             <w:r>
@@ -522,7 +527,7 @@
       <w:tr>
         <w:tc>
           <w:tcPr>
-            <w:tcW w:type="dxa" w:w="1601"/>
+            <w:tcW w:type="dxa" w:w="2422"/>
           </w:tcPr>
           <w:p>
             <w:r>
@@ -532,7 +537,7 @@
         </w:tc>
         <w:tc>
           <w:tcPr>
-            <w:tcW w:type="dxa" w:w="1601"/>
+            <w:tcW w:type="dxa" w:w="2422"/>
           </w:tcPr>
           <w:p>
             <w:r>
@@ -542,7 +547,7 @@
         </w:tc>
         <w:tc>
           <w:tcPr>
-            <w:tcW w:type="dxa" w:w="1601"/>
+            <w:tcW w:type="dxa" w:w="2422"/>
           </w:tcPr>
           <w:p>
             <w:r>
@@ -552,7 +557,7 @@
         </w:tc>
         <w:tc>
           <w:tcPr>
-            <w:tcW w:type="dxa" w:w="1601"/>
+            <w:tcW w:type="dxa" w:w="2422"/>
           </w:tcPr>
           <w:p>
             <w:r>
@@ -562,7 +567,7 @@
         </w:tc>
         <w:tc>
           <w:tcPr>
-            <w:tcW w:type="dxa" w:w="1601"/>
+            <w:tcW w:type="dxa" w:w="2422"/>
           </w:tcPr>
           <w:p>
             <w:r>
@@ -572,7 +577,7 @@
         </w:tc>
         <w:tc>
           <w:tcPr>
-            <w:tcW w:type="dxa" w:w="1601"/>
+            <w:tcW w:type="dxa" w:w="2422"/>
           </w:tcPr>
           <w:p>
             <w:r>
@@ -584,7 +589,7 @@
       <w:tr>
         <w:tc>
           <w:tcPr>
-            <w:tcW w:type="dxa" w:w="1601"/>
+            <w:tcW w:type="dxa" w:w="2422"/>
           </w:tcPr>
           <w:p>
             <w:r>
@@ -594,7 +599,7 @@
         </w:tc>
         <w:tc>
           <w:tcPr>
-            <w:tcW w:type="dxa" w:w="1601"/>
+            <w:tcW w:type="dxa" w:w="2422"/>
           </w:tcPr>
           <w:p>
             <w:r>
@@ -604,7 +609,7 @@
         </w:tc>
         <w:tc>
           <w:tcPr>
-            <w:tcW w:type="dxa" w:w="1601"/>
+            <w:tcW w:type="dxa" w:w="2422"/>
           </w:tcPr>
           <w:p>
             <w:r>
@@ -614,7 +619,7 @@
         </w:tc>
         <w:tc>
           <w:tcPr>
-            <w:tcW w:type="dxa" w:w="1601"/>
+            <w:tcW w:type="dxa" w:w="2422"/>
           </w:tcPr>
           <w:p>
             <w:r>
@@ -624,7 +629,7 @@
         </w:tc>
         <w:tc>
           <w:tcPr>
-            <w:tcW w:type="dxa" w:w="1601"/>
+            <w:tcW w:type="dxa" w:w="2422"/>
           </w:tcPr>
           <w:p>
             <w:r>
@@ -634,7 +639,7 @@
         </w:tc>
         <w:tc>
           <w:tcPr>
-            <w:tcW w:type="dxa" w:w="1601"/>
+            <w:tcW w:type="dxa" w:w="2422"/>
           </w:tcPr>
           <w:p>
             <w:r>
@@ -646,7 +651,7 @@
       <w:tr>
         <w:tc>
           <w:tcPr>
-            <w:tcW w:type="dxa" w:w="1601"/>
+            <w:tcW w:type="dxa" w:w="2422"/>
           </w:tcPr>
           <w:p>
             <w:r>
@@ -656,51 +661,51 @@
         </w:tc>
         <w:tc>
           <w:tcPr>
-            <w:tcW w:type="dxa" w:w="1601"/>
+            <w:tcW w:type="dxa" w:w="2422"/>
           </w:tcPr>
           <w:p>
             <w:r>
-              <w:t>-32.971</w:t>
+              <w:t>-33.351</w:t>
             </w:r>
           </w:p>
         </w:tc>
         <w:tc>
           <w:tcPr>
-            <w:tcW w:type="dxa" w:w="1601"/>
+            <w:tcW w:type="dxa" w:w="2422"/>
           </w:tcPr>
           <w:p>
             <w:r>
-              <w:t>4.256</w:t>
+              <w:t>4.311</w:t>
             </w:r>
           </w:p>
         </w:tc>
         <w:tc>
           <w:tcPr>
-            <w:tcW w:type="dxa" w:w="1601"/>
+            <w:tcW w:type="dxa" w:w="2422"/>
           </w:tcPr>
           <w:p>
             <w:r>
-              <w:t>-0.137</w:t>
+              <w:t>-0.073</w:t>
             </w:r>
           </w:p>
         </w:tc>
         <w:tc>
           <w:tcPr>
-            <w:tcW w:type="dxa" w:w="1601"/>
+            <w:tcW w:type="dxa" w:w="2422"/>
           </w:tcPr>
           <w:p>
             <w:r>
-              <w:t>0.450</w:t>
+              <w:t>0.050</w:t>
             </w:r>
           </w:p>
         </w:tc>
         <w:tc>
           <w:tcPr>
-            <w:tcW w:type="dxa" w:w="1601"/>
+            <w:tcW w:type="dxa" w:w="2422"/>
           </w:tcPr>
           <w:p>
             <w:r>
-              <w:t>9.981</w:t>
+              <w:t>9.989</w:t>
             </w:r>
           </w:p>
         </w:tc>
@@ -713,7 +718,7 @@
     </w:p>
     <w:p>
       <w:r>
-        <w:t>与课件参考相比，本次 SAC 最大绝对速度误差为 32.455mm/s，大于示意图约 14.1mm/s；恢复时间 0.068s 与参考 0.08s 为相同量级。控制电压先主动升高，再回到带载巡航值，复现了主要机制趋势，但峰值、回弹和时间历程没有逐点吻合。INT8 的故障后 RMS 为 4.256mm/s，FP32 为 4.110mm/s；INT8 仍有量化纹波，按相同严格判据在 0.450s 恢复，晚于 FP32，不能称为两条曲线完全重合。</w:t>
+        <w:t>与课件参考相比，本次 SAC 最大绝对速度误差为 32.455mm/s，大于示意图约 14.1mm/s；恢复时间 0.068s 与参考 0.08s 为相同量级。控制电压先主动升高，再回到带载巡航值，复现了主要机制趋势，但峰值、回弹和时间历程没有逐点吻合。INT8 的故障后 RMS 为 4.311mm/s，FP32 为 4.110mm/s；INT8 仍有量化纹波，按相同严格判据在 0.050s 恢复，早于 FP32；该带宽判据不表示所有误差指标都更优，不能称为两条曲线完全重合。</w:t>
       </w:r>
     </w:p>
     <w:p>
@@ -731,7 +736,7 @@
     </w:p>
     <w:p>
       <w:r>
-        <w:t>安全演示独立采用 ẋ=v、v̇=1850u−14v（mm、mm/s）的二阶模型，机械边界为 0–100mm，内缩安全边界为 1.2–98.8mm。κ1=κ2=24，因此 α1=48、α2=576。提供代码的 580 与 48 不能分解为两个实正递归极点，本实现使用可核查的 576。</w:t>
+        <w:t>安全演示独立采用 ẋ=v、v̇=2640u−14v（mm、mm/s）的二阶课堂模型，机械边界为 0–100mm，内缩安全边界为 1.2–98.8mm。κ1=49、κ2=49，因此 α1=98、α2=2401。参数由 safety_config.json 公开声明，不是四状态对象的辨识参数；传播模型、QP 与独立数值验证始终使用同一组系数。</w:t>
       </w:r>
     </w:p>
     <w:p>
@@ -741,7 +746,7 @@
     </w:p>
     <w:p>
       <w:r>
-        <w:t>本次首次干预为 0.052000s，最小安全电压为 -0.301074V，1s 末位移为 98.799999843mm。未保护轨迹在 0.131285964s 首次到达 100mm，之后记为 NaN（实验已终止），没有伪造碰撞后的平顶轨迹。</w:t>
+        <w:t>本次首次干预为 0.065000s，最小安全电压为 -3.091605V，1s 末位移为 98.800000000mm。未保护轨迹在 0.104891149s 首次到达 100mm，之后记为 NaN（实验已终止），没有伪造碰撞后的平顶轨迹。</w:t>
       </w:r>
     </w:p>
     <w:p>
@@ -764,17 +769,22 @@
     </w:p>
     <w:p>
       <w:r>
-        <w:t>边缘导出采用 SmoothQuant 式输入/权重逐通道平衡：c 为校准输入均值，xmax_j=max|cal_j−c_j|，wmax_j=max|W_pruned[:,j]|，s_j=max(xmax_j,ε)^α/max(wmax_j,ε)^(1−α)，本次最终选用 α=0.50、ε=1e−5。中心化输入幅度不超过 ε 的通道尺度设为 1。输入 z=(o−c)/s，首层折叠为 W′=W·diag(s)、b′=b+Wc；量化前与原稀疏网络代数等价，剪枝掩码及 FP32/pruned 路径不变。</w:t>
+        <w:t>边缘导出采用 SmoothQuant 式输入/权重逐通道平衡：c 为校准输入均值，xmax_j=max|cal_j−c_j|，wmax_j=max|W_pruned[:,j]|，s_j=max(xmax_j,ε)^α/max(wmax_j,ε)^(1−α)，本次最终选用 α=0.75、ε=1e−5。中心化输入幅度不超过 ε 的通道尺度设为 1。输入 z=(o−c)/s，首层折叠为 W′=W·diag(s)、b′=b+Wc；量化前与原稀疏网络代数等价，剪枝掩码及 FP32/pruned 路径不变。</w:t>
       </w:r>
     </w:p>
     <w:p>
       <w:r>
-        <w:t>α 在最终完整校准集合上按 INT8 相对固定剪枝 FP32 actor 的动作 MAE，从 0.25/0.5/0.75 中选择。留出观察和故障测试的实际闭环输出不参与选参。此前缀不同于 Gym 固定工程尺度，中心和尺度随 v2 工件保存，推理不重新估计统计量。</w:t>
+        <w:t>α 在最终完整校准集合上按 INT8 相对固定剪枝 FP32 actor 的动作 MAE，从 0.25/0.5/0.75 中选择。留出观察和故障测试的实际闭环输出不参与选参。此前缀不同于 Gym 固定工程尺度，中心和尺度随 v3 工件保存，推理不重新估计统计量。</w:t>
       </w:r>
     </w:p>
     <w:p>
       <w:r>
-        <w:t>输入前缀、输入量化和末端 tanh 保留浮点；权重/层间激活为 INT8，点积累加为 INT32，定点重缩放为 INT64，因此不称全路径纯整数。当前为 Python/NumPy CPU 实现；下表给出实际文件体积和计时，不套用课件 0.06ms 或 92.5% 压缩率。</w:t>
+        <w:t>v3 使用逐输出通道对称 INT8 权重、仿射 INT8 隐层激活、INT32 点积与偏置累加、INT64 定点重缩放；最后线性层保留 INT32 logits，直到 tanh 边界才反量化。ReLU 层间正对角缩放在量化前代数等价，并保留所有稀疏零掩码。输入前缀、输入量化和末端 tanh 保留浮点，因此不称全路径纯整数，也不把最终 logits 误称 INT8。当前为 Python/NumPy CPU 实现；下表给出实际文件体积和计时，不套用课件 0.06ms 或 92.5% 压缩率。</w:t>
+      </w:r>
+    </w:p>
+    <w:p>
+      <w:r>
+        <w:t>固定掩码压缩先执行 8000 步教师动作蒸馏，再执行 15000 步低学习率余弦 Adam 精修，总计 23000 步；只按校准损失保留结果，不增加 SAC 环境交互步数，也不依据闭环测试选择模型。</w:t>
       </w:r>
     </w:p>
     <w:p>
@@ -789,14 +799,14 @@
         <w:tblLook w:firstColumn="1" w:firstRow="1" w:lastColumn="0" w:lastRow="0" w:noHBand="0" w:noVBand="1" w:val="04A0"/>
       </w:tblPr>
       <w:tblGrid>
-        <w:gridCol w:w="3202"/>
-        <w:gridCol w:w="3202"/>
-        <w:gridCol w:w="3202"/>
+        <w:gridCol w:w="4843"/>
+        <w:gridCol w:w="4843"/>
+        <w:gridCol w:w="4843"/>
       </w:tblGrid>
       <w:tr>
         <w:tc>
           <w:tcPr>
-            <w:tcW w:type="dxa" w:w="3202"/>
+            <w:tcW w:type="dxa" w:w="4843"/>
           </w:tcPr>
           <w:p>
             <w:r>
@@ -806,7 +816,7 @@
         </w:tc>
         <w:tc>
           <w:tcPr>
-            <w:tcW w:type="dxa" w:w="3202"/>
+            <w:tcW w:type="dxa" w:w="4843"/>
           </w:tcPr>
           <w:p>
             <w:r>
@@ -816,7 +826,7 @@
         </w:tc>
         <w:tc>
           <w:tcPr>
-            <w:tcW w:type="dxa" w:w="3202"/>
+            <w:tcW w:type="dxa" w:w="4843"/>
           </w:tcPr>
           <w:p>
             <w:r>
@@ -828,7 +838,7 @@
       <w:tr>
         <w:tc>
           <w:tcPr>
-            <w:tcW w:type="dxa" w:w="3202"/>
+            <w:tcW w:type="dxa" w:w="4843"/>
           </w:tcPr>
           <w:p>
             <w:r>
@@ -838,17 +848,17 @@
         </w:tc>
         <w:tc>
           <w:tcPr>
-            <w:tcW w:type="dxa" w:w="3202"/>
+            <w:tcW w:type="dxa" w:w="4843"/>
           </w:tcPr>
           <w:p>
             <w:r>
-              <w:t>0.01717748</w:t>
+              <w:t>0.01195125</w:t>
             </w:r>
           </w:p>
         </w:tc>
         <w:tc>
           <w:tcPr>
-            <w:tcW w:type="dxa" w:w="3202"/>
+            <w:tcW w:type="dxa" w:w="4843"/>
           </w:tcPr>
           <w:p>
             <w:r>
@@ -860,7 +870,7 @@
       <w:tr>
         <w:tc>
           <w:tcPr>
-            <w:tcW w:type="dxa" w:w="3202"/>
+            <w:tcW w:type="dxa" w:w="4843"/>
           </w:tcPr>
           <w:p>
             <w:r>
@@ -870,21 +880,21 @@
         </w:tc>
         <w:tc>
           <w:tcPr>
-            <w:tcW w:type="dxa" w:w="3202"/>
+            <w:tcW w:type="dxa" w:w="4843"/>
           </w:tcPr>
           <w:p>
             <w:r>
-              <w:t>0.01679127</w:t>
+              <w:t>0.01226471</w:t>
             </w:r>
           </w:p>
         </w:tc>
         <w:tc>
           <w:tcPr>
-            <w:tcW w:type="dxa" w:w="3202"/>
+            <w:tcW w:type="dxa" w:w="4843"/>
           </w:tcPr>
           <w:p>
             <w:r>
-              <w:t>采用</w:t>
+              <w:t>未采用</w:t>
             </w:r>
           </w:p>
         </w:tc>
@@ -892,7 +902,7 @@
       <w:tr>
         <w:tc>
           <w:tcPr>
-            <w:tcW w:type="dxa" w:w="3202"/>
+            <w:tcW w:type="dxa" w:w="4843"/>
           </w:tcPr>
           <w:p>
             <w:r>
@@ -902,21 +912,21 @@
         </w:tc>
         <w:tc>
           <w:tcPr>
-            <w:tcW w:type="dxa" w:w="3202"/>
+            <w:tcW w:type="dxa" w:w="4843"/>
           </w:tcPr>
           <w:p>
             <w:r>
-              <w:t>0.01752568</w:t>
+              <w:t>0.01180223</w:t>
             </w:r>
           </w:p>
         </w:tc>
         <w:tc>
           <w:tcPr>
-            <w:tcW w:type="dxa" w:w="3202"/>
+            <w:tcW w:type="dxa" w:w="4843"/>
           </w:tcPr>
           <w:p>
             <w:r>
-              <w:t>未采用</w:t>
+              <w:t>采用</w:t>
             </w:r>
           </w:p>
         </w:tc>
@@ -934,15 +944,15 @@
         <w:tblLook w:firstColumn="1" w:firstRow="1" w:lastColumn="0" w:lastRow="0" w:noHBand="0" w:noVBand="1" w:val="04A0"/>
       </w:tblPr>
       <w:tblGrid>
-        <w:gridCol w:w="2401"/>
-        <w:gridCol w:w="2401"/>
-        <w:gridCol w:w="2401"/>
-        <w:gridCol w:w="2401"/>
+        <w:gridCol w:w="3632"/>
+        <w:gridCol w:w="3632"/>
+        <w:gridCol w:w="3632"/>
+        <w:gridCol w:w="3632"/>
       </w:tblGrid>
       <w:tr>
         <w:tc>
           <w:tcPr>
-            <w:tcW w:type="dxa" w:w="2401"/>
+            <w:tcW w:type="dxa" w:w="3632"/>
           </w:tcPr>
           <w:p>
             <w:r>
@@ -952,7 +962,7 @@
         </w:tc>
         <w:tc>
           <w:tcPr>
-            <w:tcW w:type="dxa" w:w="2401"/>
+            <w:tcW w:type="dxa" w:w="3632"/>
           </w:tcPr>
           <w:p>
             <w:r>
@@ -962,7 +972,7 @@
         </w:tc>
         <w:tc>
           <w:tcPr>
-            <w:tcW w:type="dxa" w:w="2401"/>
+            <w:tcW w:type="dxa" w:w="3632"/>
           </w:tcPr>
           <w:p>
             <w:r>
@@ -972,7 +982,7 @@
         </w:tc>
         <w:tc>
           <w:tcPr>
-            <w:tcW w:type="dxa" w:w="2401"/>
+            <w:tcW w:type="dxa" w:w="3632"/>
           </w:tcPr>
           <w:p>
             <w:r>
@@ -984,7 +994,7 @@
       <w:tr>
         <w:tc>
           <w:tcPr>
-            <w:tcW w:type="dxa" w:w="2401"/>
+            <w:tcW w:type="dxa" w:w="3632"/>
           </w:tcPr>
           <w:p>
             <w:r>
@@ -994,7 +1004,7 @@
         </w:tc>
         <w:tc>
           <w:tcPr>
-            <w:tcW w:type="dxa" w:w="2401"/>
+            <w:tcW w:type="dxa" w:w="3632"/>
           </w:tcPr>
           <w:p>
             <w:r>
@@ -1004,21 +1014,21 @@
         </w:tc>
         <w:tc>
           <w:tcPr>
-            <w:tcW w:type="dxa" w:w="2401"/>
+            <w:tcW w:type="dxa" w:w="3632"/>
           </w:tcPr>
           <w:p>
             <w:r>
-              <w:t>0.008372</w:t>
+              <w:t>0.008212</w:t>
             </w:r>
           </w:p>
         </w:tc>
         <w:tc>
           <w:tcPr>
-            <w:tcW w:type="dxa" w:w="2401"/>
+            <w:tcW w:type="dxa" w:w="3632"/>
           </w:tcPr>
           <w:p>
             <w:r>
-              <w:t>0.008773</w:t>
+              <w:t>0.008716</w:t>
             </w:r>
           </w:p>
         </w:tc>
@@ -1026,7 +1036,7 @@
       <w:tr>
         <w:tc>
           <w:tcPr>
-            <w:tcW w:type="dxa" w:w="2401"/>
+            <w:tcW w:type="dxa" w:w="3632"/>
           </w:tcPr>
           <w:p>
             <w:r>
@@ -1036,31 +1046,31 @@
         </w:tc>
         <w:tc>
           <w:tcPr>
-            <w:tcW w:type="dxa" w:w="2401"/>
+            <w:tcW w:type="dxa" w:w="3632"/>
           </w:tcPr>
           <w:p>
             <w:r>
-              <w:t>9394</w:t>
+              <w:t>9396</w:t>
             </w:r>
           </w:p>
         </w:tc>
         <w:tc>
           <w:tcPr>
-            <w:tcW w:type="dxa" w:w="2401"/>
+            <w:tcW w:type="dxa" w:w="3632"/>
           </w:tcPr>
           <w:p>
             <w:r>
-              <w:t>0.008402</w:t>
+              <w:t>0.008252</w:t>
             </w:r>
           </w:p>
         </w:tc>
         <w:tc>
           <w:tcPr>
-            <w:tcW w:type="dxa" w:w="2401"/>
+            <w:tcW w:type="dxa" w:w="3632"/>
           </w:tcPr>
           <w:p>
             <w:r>
-              <w:t>0.009083</w:t>
+              <w:t>0.008473</w:t>
             </w:r>
           </w:p>
         </w:tc>
@@ -1068,7 +1078,7 @@
       <w:tr>
         <w:tc>
           <w:tcPr>
-            <w:tcW w:type="dxa" w:w="2401"/>
+            <w:tcW w:type="dxa" w:w="3632"/>
           </w:tcPr>
           <w:p>
             <w:r>
@@ -1078,31 +1088,31 @@
         </w:tc>
         <w:tc>
           <w:tcPr>
-            <w:tcW w:type="dxa" w:w="2401"/>
+            <w:tcW w:type="dxa" w:w="3632"/>
           </w:tcPr>
           <w:p>
             <w:r>
-              <w:t>4940</w:t>
+              <w:t>9171</w:t>
             </w:r>
           </w:p>
         </w:tc>
         <w:tc>
           <w:tcPr>
-            <w:tcW w:type="dxa" w:w="2401"/>
+            <w:tcW w:type="dxa" w:w="3632"/>
           </w:tcPr>
           <w:p>
             <w:r>
-              <w:t>0.049703</w:t>
+              <w:t>0.036786</w:t>
             </w:r>
           </w:p>
         </w:tc>
         <w:tc>
           <w:tcPr>
-            <w:tcW w:type="dxa" w:w="2401"/>
+            <w:tcW w:type="dxa" w:w="3632"/>
           </w:tcPr>
           <w:p>
             <w:r>
-              <w:t>0.080314</w:t>
+              <w:t>0.051791</w:t>
             </w:r>
           </w:p>
         </w:tc>
@@ -1120,13 +1130,13 @@
         <w:tblLook w:firstColumn="1" w:firstRow="1" w:lastColumn="0" w:lastRow="0" w:noHBand="0" w:noVBand="1" w:val="04A0"/>
       </w:tblPr>
       <w:tblGrid>
-        <w:gridCol w:w="4802"/>
-        <w:gridCol w:w="4802"/>
+        <w:gridCol w:w="7265"/>
+        <w:gridCol w:w="7265"/>
       </w:tblGrid>
       <w:tr>
         <w:tc>
           <w:tcPr>
-            <w:tcW w:type="dxa" w:w="4802"/>
+            <w:tcW w:type="dxa" w:w="7265"/>
           </w:tcPr>
           <w:p>
             <w:r>
@@ -1136,7 +1146,7 @@
         </w:tc>
         <w:tc>
           <w:tcPr>
-            <w:tcW w:type="dxa" w:w="4802"/>
+            <w:tcW w:type="dxa" w:w="7265"/>
           </w:tcPr>
           <w:p>
             <w:r>
@@ -1148,7 +1158,7 @@
       <w:tr>
         <w:tc>
           <w:tcPr>
-            <w:tcW w:type="dxa" w:w="4802"/>
+            <w:tcW w:type="dxa" w:w="7265"/>
           </w:tcPr>
           <w:p>
             <w:r>
@@ -1158,7 +1168,7 @@
         </w:tc>
         <w:tc>
           <w:tcPr>
-            <w:tcW w:type="dxa" w:w="4802"/>
+            <w:tcW w:type="dxa" w:w="7265"/>
           </w:tcPr>
           <w:p>
             <w:r>
@@ -1170,7 +1180,7 @@
       <w:tr>
         <w:tc>
           <w:tcPr>
-            <w:tcW w:type="dxa" w:w="4802"/>
+            <w:tcW w:type="dxa" w:w="7265"/>
           </w:tcPr>
           <w:p>
             <w:r>
@@ -1180,11 +1190,11 @@
         </w:tc>
         <w:tc>
           <w:tcPr>
-            <w:tcW w:type="dxa" w:w="4802"/>
+            <w:tcW w:type="dxa" w:w="7265"/>
           </w:tcPr>
           <w:p>
             <w:r>
-              <w:t>0.03983659</w:t>
+              <w:t>0.03765549</w:t>
             </w:r>
           </w:p>
         </w:tc>
@@ -1192,7 +1202,7 @@
       <w:tr>
         <w:tc>
           <w:tcPr>
-            <w:tcW w:type="dxa" w:w="4802"/>
+            <w:tcW w:type="dxa" w:w="7265"/>
           </w:tcPr>
           <w:p>
             <w:r>
@@ -1202,11 +1212,11 @@
         </w:tc>
         <w:tc>
           <w:tcPr>
-            <w:tcW w:type="dxa" w:w="4802"/>
+            <w:tcW w:type="dxa" w:w="7265"/>
           </w:tcPr>
           <w:p>
             <w:r>
-              <w:t>0.01638577</w:t>
+              <w:t>0.01191794</w:t>
             </w:r>
           </w:p>
         </w:tc>
@@ -1214,7 +1224,7 @@
       <w:tr>
         <w:tc>
           <w:tcPr>
-            <w:tcW w:type="dxa" w:w="4802"/>
+            <w:tcW w:type="dxa" w:w="7265"/>
           </w:tcPr>
           <w:p>
             <w:r>
@@ -1224,11 +1234,11 @@
         </w:tc>
         <w:tc>
           <w:tcPr>
-            <w:tcW w:type="dxa" w:w="4802"/>
+            <w:tcW w:type="dxa" w:w="7265"/>
           </w:tcPr>
           <w:p>
             <w:r>
-              <w:t>0.04338998</w:t>
+              <w:t>0.03935278</w:t>
             </w:r>
           </w:p>
         </w:tc>
@@ -1236,7 +1246,7 @@
       <w:tr>
         <w:tc>
           <w:tcPr>
-            <w:tcW w:type="dxa" w:w="4802"/>
+            <w:tcW w:type="dxa" w:w="7265"/>
           </w:tcPr>
           <w:p>
             <w:r>
@@ -1246,11 +1256,11 @@
         </w:tc>
         <w:tc>
           <w:tcPr>
-            <w:tcW w:type="dxa" w:w="4802"/>
+            <w:tcW w:type="dxa" w:w="7265"/>
           </w:tcPr>
           <w:p>
             <w:r>
-              <w:t>0.30447674</w:t>
+              <w:t>0.28071606</w:t>
             </w:r>
           </w:p>
         </w:tc>
@@ -1258,7 +1268,7 @@
       <w:tr>
         <w:tc>
           <w:tcPr>
-            <w:tcW w:type="dxa" w:w="4802"/>
+            <w:tcW w:type="dxa" w:w="7265"/>
           </w:tcPr>
           <w:p>
             <w:r>
@@ -1268,11 +1278,11 @@
         </w:tc>
         <w:tc>
           <w:tcPr>
-            <w:tcW w:type="dxa" w:w="4802"/>
+            <w:tcW w:type="dxa" w:w="7265"/>
           </w:tcPr>
           <w:p>
             <w:r>
-              <w:t>1.228353</w:t>
+              <w:t>1.360457</w:t>
             </w:r>
           </w:p>
         </w:tc>
@@ -1280,7 +1290,7 @@
       <w:tr>
         <w:tc>
           <w:tcPr>
-            <w:tcW w:type="dxa" w:w="4802"/>
+            <w:tcW w:type="dxa" w:w="7265"/>
           </w:tcPr>
           <w:p>
             <w:r>
@@ -1290,11 +1300,11 @@
         </w:tc>
         <w:tc>
           <w:tcPr>
-            <w:tcW w:type="dxa" w:w="4802"/>
+            <w:tcW w:type="dxa" w:w="7265"/>
           </w:tcPr>
           <w:p>
             <w:r>
-              <w:t>0.752782</w:t>
+              <w:t>0.611617</w:t>
             </w:r>
           </w:p>
         </w:tc>
@@ -1302,7 +1312,7 @@
       <w:tr>
         <w:tc>
           <w:tcPr>
-            <w:tcW w:type="dxa" w:w="4802"/>
+            <w:tcW w:type="dxa" w:w="7265"/>
           </w:tcPr>
           <w:p>
             <w:r>
@@ -1312,11 +1322,11 @@
         </w:tc>
         <w:tc>
           <w:tcPr>
-            <w:tcW w:type="dxa" w:w="4802"/>
+            <w:tcW w:type="dxa" w:w="7265"/>
           </w:tcPr>
           <w:p>
             <w:r>
-              <w:t>0.00000000</w:t>
+              <w:t>0.00002500</w:t>
             </w:r>
           </w:p>
         </w:tc>
@@ -1324,7 +1334,7 @@
       <w:tr>
         <w:tc>
           <w:tcPr>
-            <w:tcW w:type="dxa" w:w="4802"/>
+            <w:tcW w:type="dxa" w:w="7265"/>
           </w:tcPr>
           <w:p>
             <w:r>
@@ -1334,7 +1344,7 @@
         </w:tc>
         <w:tc>
           <w:tcPr>
-            <w:tcW w:type="dxa" w:w="4802"/>
+            <w:tcW w:type="dxa" w:w="7265"/>
           </w:tcPr>
           <w:p>
             <w:r>
@@ -1346,7 +1356,7 @@
       <w:tr>
         <w:tc>
           <w:tcPr>
-            <w:tcW w:type="dxa" w:w="4802"/>
+            <w:tcW w:type="dxa" w:w="7265"/>
           </w:tcPr>
           <w:p>
             <w:r>
@@ -1356,11 +1366,11 @@
         </w:tc>
         <w:tc>
           <w:tcPr>
-            <w:tcW w:type="dxa" w:w="4802"/>
+            <w:tcW w:type="dxa" w:w="7265"/>
           </w:tcPr>
           <w:p>
             <w:r>
-              <w:t>0.5000</w:t>
+              <w:t>0.7500</w:t>
             </w:r>
           </w:p>
         </w:tc>
@@ -1368,7 +1378,7 @@
       <w:tr>
         <w:tc>
           <w:tcPr>
-            <w:tcW w:type="dxa" w:w="4802"/>
+            <w:tcW w:type="dxa" w:w="7265"/>
           </w:tcPr>
           <w:p>
             <w:r>
@@ -1378,11 +1388,11 @@
         </w:tc>
         <w:tc>
           <w:tcPr>
-            <w:tcW w:type="dxa" w:w="4802"/>
+            <w:tcW w:type="dxa" w:w="7265"/>
           </w:tcPr>
           <w:p>
             <w:r>
-              <w:t>8000</w:t>
+              <w:t>23000</w:t>
             </w:r>
           </w:p>
         </w:tc>
@@ -1408,13 +1418,13 @@
         <w:tblLook w:firstColumn="1" w:firstRow="1" w:lastColumn="0" w:lastRow="0" w:noHBand="0" w:noVBand="1" w:val="04A0"/>
       </w:tblPr>
       <w:tblGrid>
-        <w:gridCol w:w="4802"/>
-        <w:gridCol w:w="4802"/>
+        <w:gridCol w:w="7265"/>
+        <w:gridCol w:w="7265"/>
       </w:tblGrid>
       <w:tr>
         <w:tc>
           <w:tcPr>
-            <w:tcW w:type="dxa" w:w="4802"/>
+            <w:tcW w:type="dxa" w:w="7265"/>
           </w:tcPr>
           <w:p>
             <w:r>
@@ -1424,7 +1434,7 @@
         </w:tc>
         <w:tc>
           <w:tcPr>
-            <w:tcW w:type="dxa" w:w="4802"/>
+            <w:tcW w:type="dxa" w:w="7265"/>
           </w:tcPr>
           <w:p>
             <w:r>
@@ -1436,7 +1446,7 @@
       <w:tr>
         <w:tc>
           <w:tcPr>
-            <w:tcW w:type="dxa" w:w="4802"/>
+            <w:tcW w:type="dxa" w:w="7265"/>
           </w:tcPr>
           <w:p>
             <w:r>
@@ -1446,7 +1456,7 @@
         </w:tc>
         <w:tc>
           <w:tcPr>
-            <w:tcW w:type="dxa" w:w="4802"/>
+            <w:tcW w:type="dxa" w:w="7265"/>
           </w:tcPr>
           <w:p>
             <w:r>
@@ -1458,7 +1468,7 @@
       <w:tr>
         <w:tc>
           <w:tcPr>
-            <w:tcW w:type="dxa" w:w="4802"/>
+            <w:tcW w:type="dxa" w:w="7265"/>
           </w:tcPr>
           <w:p>
             <w:r>
@@ -1468,7 +1478,7 @@
         </w:tc>
         <w:tc>
           <w:tcPr>
-            <w:tcW w:type="dxa" w:w="4802"/>
+            <w:tcW w:type="dxa" w:w="7265"/>
           </w:tcPr>
           <w:p>
             <w:r>
@@ -1480,7 +1490,7 @@
       <w:tr>
         <w:tc>
           <w:tcPr>
-            <w:tcW w:type="dxa" w:w="4802"/>
+            <w:tcW w:type="dxa" w:w="7265"/>
           </w:tcPr>
           <w:p>
             <w:r>
@@ -1490,7 +1500,7 @@
         </w:tc>
         <w:tc>
           <w:tcPr>
-            <w:tcW w:type="dxa" w:w="4802"/>
+            <w:tcW w:type="dxa" w:w="7265"/>
           </w:tcPr>
           <w:p>
             <w:r>
@@ -1502,7 +1512,7 @@
       <w:tr>
         <w:tc>
           <w:tcPr>
-            <w:tcW w:type="dxa" w:w="4802"/>
+            <w:tcW w:type="dxa" w:w="7265"/>
           </w:tcPr>
           <w:p>
             <w:r>
@@ -1512,7 +1522,7 @@
         </w:tc>
         <w:tc>
           <w:tcPr>
-            <w:tcW w:type="dxa" w:w="4802"/>
+            <w:tcW w:type="dxa" w:w="7265"/>
           </w:tcPr>
           <w:p>
             <w:r>
@@ -1524,7 +1534,7 @@
       <w:tr>
         <w:tc>
           <w:tcPr>
-            <w:tcW w:type="dxa" w:w="4802"/>
+            <w:tcW w:type="dxa" w:w="7265"/>
           </w:tcPr>
           <w:p>
             <w:r>
@@ -1534,7 +1544,7 @@
         </w:tc>
         <w:tc>
           <w:tcPr>
-            <w:tcW w:type="dxa" w:w="4802"/>
+            <w:tcW w:type="dxa" w:w="7265"/>
           </w:tcPr>
           <w:p>
             <w:r>
@@ -1546,7 +1556,7 @@
       <w:tr>
         <w:tc>
           <w:tcPr>
-            <w:tcW w:type="dxa" w:w="4802"/>
+            <w:tcW w:type="dxa" w:w="7265"/>
           </w:tcPr>
           <w:p>
             <w:r>
@@ -1556,7 +1566,7 @@
         </w:tc>
         <w:tc>
           <w:tcPr>
-            <w:tcW w:type="dxa" w:w="4802"/>
+            <w:tcW w:type="dxa" w:w="7265"/>
           </w:tcPr>
           <w:p>
             <w:r>
@@ -1568,7 +1578,7 @@
       <w:tr>
         <w:tc>
           <w:tcPr>
-            <w:tcW w:type="dxa" w:w="4802"/>
+            <w:tcW w:type="dxa" w:w="7265"/>
           </w:tcPr>
           <w:p>
             <w:r>
@@ -1578,7 +1588,7 @@
         </w:tc>
         <w:tc>
           <w:tcPr>
-            <w:tcW w:type="dxa" w:w="4802"/>
+            <w:tcW w:type="dxa" w:w="7265"/>
           </w:tcPr>
           <w:p>
             <w:r>
@@ -1590,7 +1600,7 @@
       <w:tr>
         <w:tc>
           <w:tcPr>
-            <w:tcW w:type="dxa" w:w="4802"/>
+            <w:tcW w:type="dxa" w:w="7265"/>
           </w:tcPr>
           <w:p>
             <w:r>
@@ -1600,7 +1610,7 @@
         </w:tc>
         <w:tc>
           <w:tcPr>
-            <w:tcW w:type="dxa" w:w="4802"/>
+            <w:tcW w:type="dxa" w:w="7265"/>
           </w:tcPr>
           <w:p>
             <w:r>
@@ -1612,7 +1622,7 @@
       <w:tr>
         <w:tc>
           <w:tcPr>
-            <w:tcW w:type="dxa" w:w="4802"/>
+            <w:tcW w:type="dxa" w:w="7265"/>
           </w:tcPr>
           <w:p>
             <w:r>
@@ -1622,7 +1632,7 @@
         </w:tc>
         <w:tc>
           <w:tcPr>
-            <w:tcW w:type="dxa" w:w="4802"/>
+            <w:tcW w:type="dxa" w:w="7265"/>
           </w:tcPr>
           <w:p>
             <w:r>
@@ -1634,7 +1644,7 @@
       <w:tr>
         <w:tc>
           <w:tcPr>
-            <w:tcW w:type="dxa" w:w="4802"/>
+            <w:tcW w:type="dxa" w:w="7265"/>
           </w:tcPr>
           <w:p>
             <w:r>
@@ -1644,7 +1654,7 @@
         </w:tc>
         <w:tc>
           <w:tcPr>
-            <w:tcW w:type="dxa" w:w="4802"/>
+            <w:tcW w:type="dxa" w:w="7265"/>
           </w:tcPr>
           <w:p>
             <w:r>
@@ -1656,7 +1666,7 @@
       <w:tr>
         <w:tc>
           <w:tcPr>
-            <w:tcW w:type="dxa" w:w="4802"/>
+            <w:tcW w:type="dxa" w:w="7265"/>
           </w:tcPr>
           <w:p>
             <w:r>
@@ -1666,7 +1676,7 @@
         </w:tc>
         <w:tc>
           <w:tcPr>
-            <w:tcW w:type="dxa" w:w="4802"/>
+            <w:tcW w:type="dxa" w:w="7265"/>
           </w:tcPr>
           <w:p>
             <w:r>
@@ -1678,7 +1688,7 @@
       <w:tr>
         <w:tc>
           <w:tcPr>
-            <w:tcW w:type="dxa" w:w="4802"/>
+            <w:tcW w:type="dxa" w:w="7265"/>
           </w:tcPr>
           <w:p>
             <w:r>
@@ -1688,7 +1698,7 @@
         </w:tc>
         <w:tc>
           <w:tcPr>
-            <w:tcW w:type="dxa" w:w="4802"/>
+            <w:tcW w:type="dxa" w:w="7265"/>
           </w:tcPr>
           <w:p>
             <w:r>
@@ -1700,7 +1710,7 @@
       <w:tr>
         <w:tc>
           <w:tcPr>
-            <w:tcW w:type="dxa" w:w="4802"/>
+            <w:tcW w:type="dxa" w:w="7265"/>
           </w:tcPr>
           <w:p>
             <w:r>
@@ -1710,7 +1720,7 @@
         </w:tc>
         <w:tc>
           <w:tcPr>
-            <w:tcW w:type="dxa" w:w="4802"/>
+            <w:tcW w:type="dxa" w:w="7265"/>
           </w:tcPr>
           <w:p>
             <w:r>
@@ -1722,7 +1732,7 @@
       <w:tr>
         <w:tc>
           <w:tcPr>
-            <w:tcW w:type="dxa" w:w="4802"/>
+            <w:tcW w:type="dxa" w:w="7265"/>
           </w:tcPr>
           <w:p>
             <w:r>
@@ -1732,7 +1742,7 @@
         </w:tc>
         <w:tc>
           <w:tcPr>
-            <w:tcW w:type="dxa" w:w="4802"/>
+            <w:tcW w:type="dxa" w:w="7265"/>
           </w:tcPr>
           <w:p>
             <w:r>
@@ -1744,7 +1754,7 @@
       <w:tr>
         <w:tc>
           <w:tcPr>
-            <w:tcW w:type="dxa" w:w="4802"/>
+            <w:tcW w:type="dxa" w:w="7265"/>
           </w:tcPr>
           <w:p>
             <w:r>
@@ -1754,7 +1764,7 @@
         </w:tc>
         <w:tc>
           <w:tcPr>
-            <w:tcW w:type="dxa" w:w="4802"/>
+            <w:tcW w:type="dxa" w:w="7265"/>
           </w:tcPr>
           <w:p>
             <w:r>
@@ -1766,7 +1776,7 @@
       <w:tr>
         <w:tc>
           <w:tcPr>
-            <w:tcW w:type="dxa" w:w="4802"/>
+            <w:tcW w:type="dxa" w:w="7265"/>
           </w:tcPr>
           <w:p>
             <w:r>
@@ -1776,7 +1786,7 @@
         </w:tc>
         <w:tc>
           <w:tcPr>
-            <w:tcW w:type="dxa" w:w="4802"/>
+            <w:tcW w:type="dxa" w:w="7265"/>
           </w:tcPr>
           <w:p>
             <w:r>
@@ -1788,7 +1798,7 @@
       <w:tr>
         <w:tc>
           <w:tcPr>
-            <w:tcW w:type="dxa" w:w="4802"/>
+            <w:tcW w:type="dxa" w:w="7265"/>
           </w:tcPr>
           <w:p>
             <w:r>
@@ -1798,7 +1808,7 @@
         </w:tc>
         <w:tc>
           <w:tcPr>
-            <w:tcW w:type="dxa" w:w="4802"/>
+            <w:tcW w:type="dxa" w:w="7265"/>
           </w:tcPr>
           <w:p>
             <w:r>
@@ -1810,7 +1820,7 @@
       <w:tr>
         <w:tc>
           <w:tcPr>
-            <w:tcW w:type="dxa" w:w="4802"/>
+            <w:tcW w:type="dxa" w:w="7265"/>
           </w:tcPr>
           <w:p>
             <w:r>
@@ -1820,7 +1830,7 @@
         </w:tc>
         <w:tc>
           <w:tcPr>
-            <w:tcW w:type="dxa" w:w="4802"/>
+            <w:tcW w:type="dxa" w:w="7265"/>
           </w:tcPr>
           <w:p>
             <w:r>
@@ -1832,7 +1842,7 @@
       <w:tr>
         <w:tc>
           <w:tcPr>
-            <w:tcW w:type="dxa" w:w="4802"/>
+            <w:tcW w:type="dxa" w:w="7265"/>
           </w:tcPr>
           <w:p>
             <w:r>
@@ -1842,7 +1852,7 @@
         </w:tc>
         <w:tc>
           <w:tcPr>
-            <w:tcW w:type="dxa" w:w="4802"/>
+            <w:tcW w:type="dxa" w:w="7265"/>
           </w:tcPr>
           <w:p>
             <w:r>
@@ -1854,7 +1864,7 @@
       <w:tr>
         <w:tc>
           <w:tcPr>
-            <w:tcW w:type="dxa" w:w="4802"/>
+            <w:tcW w:type="dxa" w:w="7265"/>
           </w:tcPr>
           <w:p>
             <w:r>
@@ -1864,7 +1874,7 @@
         </w:tc>
         <w:tc>
           <w:tcPr>
-            <w:tcW w:type="dxa" w:w="4802"/>
+            <w:tcW w:type="dxa" w:w="7265"/>
           </w:tcPr>
           <w:p>
             <w:r>
@@ -1876,7 +1886,7 @@
       <w:tr>
         <w:tc>
           <w:tcPr>
-            <w:tcW w:type="dxa" w:w="4802"/>
+            <w:tcW w:type="dxa" w:w="7265"/>
           </w:tcPr>
           <w:p>
             <w:r>
@@ -1886,7 +1896,7 @@
         </w:tc>
         <w:tc>
           <w:tcPr>
-            <w:tcW w:type="dxa" w:w="4802"/>
+            <w:tcW w:type="dxa" w:w="7265"/>
           </w:tcPr>
           <w:p>
             <w:r>
@@ -1898,7 +1908,7 @@
       <w:tr>
         <w:tc>
           <w:tcPr>
-            <w:tcW w:type="dxa" w:w="4802"/>
+            <w:tcW w:type="dxa" w:w="7265"/>
           </w:tcPr>
           <w:p>
             <w:r>
@@ -1908,7 +1918,7 @@
         </w:tc>
         <w:tc>
           <w:tcPr>
-            <w:tcW w:type="dxa" w:w="4802"/>
+            <w:tcW w:type="dxa" w:w="7265"/>
           </w:tcPr>
           <w:p>
             <w:r>
@@ -1920,7 +1930,7 @@
       <w:tr>
         <w:tc>
           <w:tcPr>
-            <w:tcW w:type="dxa" w:w="4802"/>
+            <w:tcW w:type="dxa" w:w="7265"/>
           </w:tcPr>
           <w:p>
             <w:r>
@@ -1930,7 +1940,7 @@
         </w:tc>
         <w:tc>
           <w:tcPr>
-            <w:tcW w:type="dxa" w:w="4802"/>
+            <w:tcW w:type="dxa" w:w="7265"/>
           </w:tcPr>
           <w:p>
             <w:r>
@@ -1942,7 +1952,7 @@
       <w:tr>
         <w:tc>
           <w:tcPr>
-            <w:tcW w:type="dxa" w:w="4802"/>
+            <w:tcW w:type="dxa" w:w="7265"/>
           </w:tcPr>
           <w:p>
             <w:r>
@@ -1952,7 +1962,7 @@
         </w:tc>
         <w:tc>
           <w:tcPr>
-            <w:tcW w:type="dxa" w:w="4802"/>
+            <w:tcW w:type="dxa" w:w="7265"/>
           </w:tcPr>
           <w:p>
             <w:r>
@@ -1972,7 +1982,7 @@
     </w:p>
     <w:p>
       <w:r>
-        <w:t>独立数值复核：在 0.15s 输入/故障重放中，native 8 子步 RK4 相对独立 Radau 的最大差为位移 9.03071e-07mm、速度 0.000202143mm/s、P1 7.07442e-05MPa、P2 2.76128e-06MPa；16/32 子步结果进一步收敛。该验证针对所记录的试验输入，详细检查与容差见 physics_validation.json。</w:t>
+        <w:t>独立数值复核：在 0.15s 输入/故障重放中，native 8 子步 RK4 相对独立 Radau 的最大差为位移 9.03069e-07mm、速度 0.000202142mm/s、P1 7.07441e-05MPa、P2 2.76127e-06MPa；16/32 子步结果进一步收敛。该验证针对所记录的试验输入，详细检查与容差见 physics_validation.json。</w:t>
       </w:r>
     </w:p>
     <w:p>
@@ -1981,7 +1991,7 @@
       </w:r>
     </w:p>
     <w:sectPr>
-      <w:pgSz w:w="11909" w:h="16834"/>
+      <w:pgSz w:w="16834" w:h="11909"/>
       <w:pgMar w:top="1008" w:right="1152" w:bottom="1008" w:left="1152" w:header="720" w:footer="720" w:gutter="0"/>
       <w:cols w:space="720"/>
       <w:docGrid w:linePitch="360"/>

</xml_diff>